<commit_message>
Rename Go module to github.com/om8P/BeeVM
The GitHub account was renamed from OmMhatre-99 to om8P. Update the
module path, imports, guide and progress log, and regenerate the
guide's Word copy.

Co-Authored-By: Claude Sonnet 5.5 <noreply@anthropic.com>
</commit_message>
<xml_diff>
--- a/developer-guide/BeeVM-guide.docx
+++ b/developer-guide/BeeVM-guide.docx
@@ -1546,7 +1546,7 @@
           <w:sz w:val="18"/>
           <w:szCs w:val="18"/>
         </w:rPr>
-        <w:t xml:space="preserve">git clone https://github.com/OmMhatre-99/BeeVM.git</w:t>
+        <w:t xml:space="preserve">git clone https://github.com/om8P/BeeVM.git</w:t>
       </w:r>
     </w:p>
     <w:p>
@@ -5409,7 +5409,7 @@
           <w:sz w:val="18"/>
           <w:szCs w:val="18"/>
         </w:rPr>
-        <w:t xml:space="preserve">go mod init github.com/OmMhatre-99/BeeVM</w:t>
+        <w:t xml:space="preserve">go mod init github.com/om8P/BeeVM</w:t>
       </w:r>
     </w:p>
     <w:p>
@@ -8023,7 +8023,7 @@
           <w:sz w:val="18"/>
           <w:szCs w:val="18"/>
         </w:rPr>
-        <w:t xml:space="preserve">gh repo create OmMhatre-99/beevm --public --source=. --remote=origin --push</w:t>
+        <w:t xml:space="preserve">gh repo create om8P/beevm --public --source=. --remote=origin --push</w:t>
       </w:r>
     </w:p>
     <w:p>
@@ -8038,7 +8038,7 @@
           <w:sz w:val="18"/>
           <w:szCs w:val="18"/>
         </w:rPr>
-        <w:t xml:space="preserve">gh repo rename BeeVM --repo OmMhatre-99/beevm --yes</w:t>
+        <w:t xml:space="preserve">gh repo rename BeeVM --repo om8P/beevm --yes</w:t>
       </w:r>
     </w:p>
     <w:p>
@@ -8053,7 +8053,7 @@
           <w:sz w:val="18"/>
           <w:szCs w:val="18"/>
         </w:rPr>
-        <w:t xml:space="preserve">git remote set-url origin https://github.com/OmMhatre-99/BeeVM.git</w:t>
+        <w:t xml:space="preserve">git remote set-url origin https://github.com/om8P/BeeVM.git</w:t>
       </w:r>
     </w:p>
     <w:p>
@@ -8124,7 +8124,7 @@
           <w:sz w:val="19"/>
           <w:szCs w:val="19"/>
         </w:rPr>
-        <w:t xml:space="preserve">github.com/OmMhatre-99/BeeVM</w:t>
+        <w:t xml:space="preserve">github.com/om8P/BeeVM</w:t>
       </w:r>
       <w:r>
         <w:rPr>

</xml_diff>